<commit_message>
Add EcoCleaning and Coco Boom projects to portfolio and CV
</commit_message>
<xml_diff>
--- a/Danil-Hordiienko-CV.docx
+++ b/Danil-Hordiienko-CV.docx
@@ -64,7 +64,7 @@
           <w:sz w:val="22"/>
           <w:szCs w:val="22"/>
         </w:rPr>
-        <w:t xml:space="preserve">Highly motivated and sociable individual with a diverse background in software development, customer service, and entertainment. Currently pursuing a degree in Software Development at ATU (4th year). Experienced in working with people, promoting products, and finding innovative ways to complete tasks efficiently.</w:t>
+        <w:t>Highly motivated and sociable individual with a diverse background in software development, independent website delivery, customer service, and entertainment. Currently pursuing a degree in Software Development at ATU (4th year). Experienced in taking web projects from idea to live deployment and finding practical, efficient ways to complete tasks.</w:t>
       </w:r>
     </w:p>
     <w:p>
@@ -182,7 +182,7 @@
           <w:sz w:val="24"/>
           <w:szCs w:val="24"/>
         </w:rPr>
-        <w:t xml:space="preserve">WORK EXPERIENCE</w:t>
+        <w:t>SELECTED WEB PROJECTS</w:t>
       </w:r>
     </w:p>
     <w:p>
@@ -197,7 +197,7 @@
           <w:sz w:val="22"/>
           <w:szCs w:val="22"/>
         </w:rPr>
-        <w:t xml:space="preserve">Retail Assistant – SuperValu, Moycullen</w:t>
+        <w:t>Independent Web Developer</w:t>
       </w:r>
       <w:r>
         <w:rPr>
@@ -208,79 +208,135 @@
           <w:sz w:val="20"/>
           <w:szCs w:val="20"/>
         </w:rPr>
-        <w:t xml:space="preserve">   6 months</w:t>
-      </w:r>
-    </w:p>
-    <w:p>
-      <w:pPr>
-        <w:pStyle w:val="ListParagraph"/>
-        <w:numPr>
-          <w:ilvl w:val="0"/>
-          <w:numId w:val="2"/>
-        </w:numPr>
-        <w:spacing w:after="40"/>
-      </w:pPr>
-      <w:r>
-        <w:rPr>
-          <w:rFonts w:ascii="Calibri" w:cs="Calibri" w:eastAsia="Calibri" w:hAnsi="Calibri"/>
-          <w:sz w:val="22"/>
-          <w:szCs w:val="22"/>
-        </w:rPr>
-        <w:t xml:space="preserve">Served customers on the shop floor and at the tills in a fast-paced retail environment.</w:t>
-      </w:r>
-    </w:p>
-    <w:p>
-      <w:pPr>
-        <w:pStyle w:val="ListParagraph"/>
-        <w:numPr>
-          <w:ilvl w:val="0"/>
-          <w:numId w:val="2"/>
-        </w:numPr>
-        <w:spacing w:after="40"/>
-      </w:pPr>
-      <w:r>
-        <w:rPr>
-          <w:rFonts w:ascii="Calibri" w:cs="Calibri" w:eastAsia="Calibri" w:hAnsi="Calibri"/>
-          <w:sz w:val="22"/>
-          <w:szCs w:val="22"/>
-        </w:rPr>
-        <w:t xml:space="preserve">Handled stock replenishment, deliveries and merchandising to keep shelves fully presented.</w:t>
-      </w:r>
-    </w:p>
-    <w:p>
-      <w:pPr>
-        <w:pStyle w:val="ListParagraph"/>
-        <w:numPr>
-          <w:ilvl w:val="0"/>
-          <w:numId w:val="2"/>
-        </w:numPr>
-        <w:spacing w:after="40"/>
-      </w:pPr>
-      <w:r>
-        <w:rPr>
-          <w:rFonts w:ascii="Calibri" w:cs="Calibri" w:eastAsia="Calibri" w:hAnsi="Calibri"/>
-          <w:sz w:val="22"/>
-          <w:szCs w:val="22"/>
-        </w:rPr>
-        <w:t xml:space="preserve">Maintained high standards of customer service, hygiene and store presentation.</w:t>
-      </w:r>
-    </w:p>
-    <w:p>
-      <w:pPr>
-        <w:pStyle w:val="ListParagraph"/>
-        <w:numPr>
-          <w:ilvl w:val="0"/>
-          <w:numId w:val="2"/>
-        </w:numPr>
-        <w:spacing w:after="40"/>
-      </w:pPr>
-      <w:r>
-        <w:rPr>
-          <w:rFonts w:ascii="Calibri" w:cs="Calibri" w:eastAsia="Calibri" w:hAnsi="Calibri"/>
-          <w:sz w:val="22"/>
-          <w:szCs w:val="22"/>
-        </w:rPr>
-        <w:t xml:space="preserve">Worked flexible shifts as part of a close-knit team, including weekends and busy periods.</w:t>
+        <w:t xml:space="preserve">   Live projects</w:t>
+      </w:r>
+    </w:p>
+    <w:p>
+      <w:pPr>
+        <w:spacing w:after="80"/>
+      </w:pPr>
+      <w:r>
+        <w:rPr>
+          <w:rFonts w:ascii="Calibri" w:cs="Calibri" w:eastAsia="Calibri" w:hAnsi="Calibri"/>
+          <w:b/>
+          <w:bCs/>
+          <w:sz w:val="22"/>
+          <w:szCs w:val="22"/>
+        </w:rPr>
+        <w:t xml:space="preserve">EcoCleaning  |  </w:t>
+      </w:r>
+      <w:hyperlink r:id="rId8">
+        <w:r>
+          <w:rPr>
+            <w:rFonts w:ascii="Calibri" w:cs="Calibri" w:eastAsia="Calibri" w:hAnsi="Calibri"/>
+            <w:sz w:val="22"/>
+            <w:szCs w:val="22"/>
+            <w:color w:val="1F4E79"/>
+            <w:u w:val="single"/>
+          </w:rPr>
+          <w:t>ecocleaning.es</w:t>
+        </w:r>
+      </w:hyperlink>
+    </w:p>
+    <w:p>
+      <w:pPr>
+        <w:pStyle w:val="ListParagraph"/>
+        <w:numPr>
+          <w:ilvl w:val="0"/>
+          <w:numId w:val="2"/>
+        </w:numPr>
+        <w:spacing w:after="40"/>
+      </w:pPr>
+      <w:r>
+        <w:rPr>
+          <w:rFonts w:ascii="Calibri" w:cs="Calibri" w:eastAsia="Calibri" w:hAnsi="Calibri"/>
+          <w:sz w:val="22"/>
+          <w:szCs w:val="22"/>
+        </w:rPr>
+        <w:t>Designed, developed and deployed a complete responsive service platform with pricing, booking, membership, customer account and AI photo-estimation experiences.</w:t>
+      </w:r>
+    </w:p>
+    <w:p>
+      <w:pPr>
+        <w:spacing w:after="80"/>
+      </w:pPr>
+      <w:r>
+        <w:rPr>
+          <w:rFonts w:ascii="Calibri" w:cs="Calibri" w:eastAsia="Calibri" w:hAnsi="Calibri"/>
+          <w:b/>
+          <w:bCs/>
+          <w:sz w:val="22"/>
+          <w:szCs w:val="22"/>
+        </w:rPr>
+        <w:t xml:space="preserve">Coco Boom  |  </w:t>
+      </w:r>
+      <w:hyperlink r:id="rId9">
+        <w:r>
+          <w:rPr>
+            <w:rFonts w:ascii="Calibri" w:cs="Calibri" w:eastAsia="Calibri" w:hAnsi="Calibri"/>
+            <w:sz w:val="22"/>
+            <w:szCs w:val="22"/>
+            <w:color w:val="1F4E79"/>
+            <w:u w:val="single"/>
+          </w:rPr>
+          <w:t>cocoboom.es</w:t>
+        </w:r>
+      </w:hyperlink>
+    </w:p>
+    <w:p>
+      <w:pPr>
+        <w:pStyle w:val="ListParagraph"/>
+        <w:numPr>
+          <w:ilvl w:val="0"/>
+          <w:numId w:val="2"/>
+        </w:numPr>
+        <w:spacing w:after="40"/>
+      </w:pPr>
+      <w:r>
+        <w:rPr>
+          <w:rFonts w:ascii="Calibri" w:cs="Calibri" w:eastAsia="Calibri" w:hAnsi="Calibri"/>
+          <w:sz w:val="22"/>
+          <w:szCs w:val="22"/>
+        </w:rPr>
+        <w:t>Designed, developed and deployed a responsive brand website for a fresh juice and smoothie bar, including interactive product presentation and location discovery.</w:t>
+      </w:r>
+    </w:p>
+    <w:p>
+      <w:pPr>
+        <w:pStyle w:val="ListParagraph"/>
+        <w:numPr>
+          <w:ilvl w:val="0"/>
+          <w:numId w:val="2"/>
+        </w:numPr>
+        <w:spacing w:after="40"/>
+      </w:pPr>
+      <w:r>
+        <w:rPr>
+          <w:rFonts w:ascii="Calibri" w:cs="Calibri" w:eastAsia="Calibri" w:hAnsi="Calibri"/>
+          <w:sz w:val="22"/>
+          <w:szCs w:val="22"/>
+        </w:rPr>
+        <w:t>Owned the full delivery process: planning, UX/UI, development, content integration, responsive testing, deployment and ongoing improvements.</w:t>
+      </w:r>
+    </w:p>
+    <w:p>
+      <w:pPr>
+        <w:pBdr>
+          <w:bottom w:val="single" w:color="1F3864" w:sz="6" w:space="4"/>
+        </w:pBdr>
+        <w:spacing w:after="90" w:before="170"/>
+      </w:pPr>
+      <w:r>
+        <w:rPr>
+          <w:rFonts w:ascii="Calibri" w:cs="Calibri" w:eastAsia="Calibri" w:hAnsi="Calibri"/>
+          <w:b/>
+          <w:bCs/>
+          <w:color w:val="1F3864"/>
+          <w:spacing w:val="20"/>
+          <w:sz w:val="24"/>
+          <w:szCs w:val="24"/>
+        </w:rPr>
+        <w:t xml:space="preserve">WORK EXPERIENCE</w:t>
       </w:r>
     </w:p>
     <w:p>
@@ -295,7 +351,7 @@
           <w:sz w:val="22"/>
           <w:szCs w:val="22"/>
         </w:rPr>
-        <w:t xml:space="preserve">Housekeeper &amp; Waiter – Abbeyglen Castle Hotel, Clifden</w:t>
+        <w:t xml:space="preserve">Retail Assistant – SuperValu, Moycullen</w:t>
       </w:r>
       <w:r>
         <w:rPr>
@@ -306,6 +362,104 @@
           <w:sz w:val="20"/>
           <w:szCs w:val="20"/>
         </w:rPr>
+        <w:t xml:space="preserve">   6 months</w:t>
+      </w:r>
+    </w:p>
+    <w:p>
+      <w:pPr>
+        <w:pStyle w:val="ListParagraph"/>
+        <w:numPr>
+          <w:ilvl w:val="0"/>
+          <w:numId w:val="2"/>
+        </w:numPr>
+        <w:spacing w:after="40"/>
+      </w:pPr>
+      <w:r>
+        <w:rPr>
+          <w:rFonts w:ascii="Calibri" w:cs="Calibri" w:eastAsia="Calibri" w:hAnsi="Calibri"/>
+          <w:sz w:val="22"/>
+          <w:szCs w:val="22"/>
+        </w:rPr>
+        <w:t xml:space="preserve">Served customers on the shop floor and at the tills in a fast-paced retail environment.</w:t>
+      </w:r>
+    </w:p>
+    <w:p>
+      <w:pPr>
+        <w:pStyle w:val="ListParagraph"/>
+        <w:numPr>
+          <w:ilvl w:val="0"/>
+          <w:numId w:val="2"/>
+        </w:numPr>
+        <w:spacing w:after="40"/>
+      </w:pPr>
+      <w:r>
+        <w:rPr>
+          <w:rFonts w:ascii="Calibri" w:cs="Calibri" w:eastAsia="Calibri" w:hAnsi="Calibri"/>
+          <w:sz w:val="22"/>
+          <w:szCs w:val="22"/>
+        </w:rPr>
+        <w:t xml:space="preserve">Handled stock replenishment, deliveries and merchandising to keep shelves fully presented.</w:t>
+      </w:r>
+    </w:p>
+    <w:p>
+      <w:pPr>
+        <w:pStyle w:val="ListParagraph"/>
+        <w:numPr>
+          <w:ilvl w:val="0"/>
+          <w:numId w:val="2"/>
+        </w:numPr>
+        <w:spacing w:after="40"/>
+      </w:pPr>
+      <w:r>
+        <w:rPr>
+          <w:rFonts w:ascii="Calibri" w:cs="Calibri" w:eastAsia="Calibri" w:hAnsi="Calibri"/>
+          <w:sz w:val="22"/>
+          <w:szCs w:val="22"/>
+        </w:rPr>
+        <w:t xml:space="preserve">Maintained high standards of customer service, hygiene and store presentation.</w:t>
+      </w:r>
+    </w:p>
+    <w:p>
+      <w:pPr>
+        <w:pStyle w:val="ListParagraph"/>
+        <w:numPr>
+          <w:ilvl w:val="0"/>
+          <w:numId w:val="2"/>
+        </w:numPr>
+        <w:spacing w:after="40"/>
+      </w:pPr>
+      <w:r>
+        <w:rPr>
+          <w:rFonts w:ascii="Calibri" w:cs="Calibri" w:eastAsia="Calibri" w:hAnsi="Calibri"/>
+          <w:sz w:val="22"/>
+          <w:szCs w:val="22"/>
+        </w:rPr>
+        <w:t xml:space="preserve">Worked flexible shifts as part of a close-knit team, including weekends and busy periods.</w:t>
+      </w:r>
+    </w:p>
+    <w:p>
+      <w:pPr>
+        <w:spacing w:after="40" w:before="140"/>
+      </w:pPr>
+      <w:r>
+        <w:rPr>
+          <w:rFonts w:ascii="Calibri" w:cs="Calibri" w:eastAsia="Calibri" w:hAnsi="Calibri"/>
+          <w:b/>
+          <w:bCs/>
+          <w:sz w:val="22"/>
+          <w:szCs w:val="22"/>
+        </w:rPr>
+        <w:t xml:space="preserve">Housekeeper &amp; Waiter – Abbeyglen Castle Hotel, Clifden</w:t>
+      </w:r>
+      <w:r>
+        <w:rPr>
+          <w:rFonts w:ascii="Calibri" w:cs="Calibri" w:eastAsia="Calibri" w:hAnsi="Calibri"/>
+          <w:i/>
+          <w:iCs/>
+          <w:color w:val="666666"/>
+          <w:sz w:val="20"/>
+          <w:szCs w:val="20"/>
+        </w:rPr>
         <w:t xml:space="preserve">   2023 · 6 months</w:t>
       </w:r>
     </w:p>
@@ -609,6 +763,24 @@
           <w:szCs w:val="22"/>
         </w:rPr>
         <w:t xml:space="preserve">Experience in IT, software development, and customer engagement</w:t>
+      </w:r>
+    </w:p>
+    <w:p>
+      <w:pPr>
+        <w:pStyle w:val="ListParagraph"/>
+        <w:numPr>
+          <w:ilvl w:val="0"/>
+          <w:numId w:val="2"/>
+        </w:numPr>
+        <w:spacing w:after="40"/>
+      </w:pPr>
+      <w:r>
+        <w:rPr>
+          <w:rFonts w:ascii="Calibri" w:cs="Calibri" w:eastAsia="Calibri" w:hAnsi="Calibri"/>
+          <w:sz w:val="22"/>
+          <w:szCs w:val="22"/>
+        </w:rPr>
+        <w:t>End-to-end website design, development, deployment and maintenance</w:t>
       </w:r>
     </w:p>
     <w:p>

</xml_diff>